<commit_message>
Accuracy corrections: Coinbase AUC $370B→$300B, remove Lloyd's attribution
Verified all factual claims against primary sources:
- Coinbase AUC corrected from $370B+ to $300B+ (actual custody figure)
- Removed specific Lloyd's of London attribution for insurance (not independently confirmed)
- All other claims verified correct: FIUSD launch, x402 Foundation, GENIUS Act,
  Stripe Bridge $1.1B, BVNK $1.8B, Mesh $75M Series C, INDX $25M FDIC, etc.

Co-Authored-By: Claude Opus 4.6 (1M context) <noreply@anthropic.com>
</commit_message>
<xml_diff>
--- a/deliverables/Fiserv_Crypto_Strategy_Full_Analysis.docx
+++ b/deliverables/Fiserv_Crypto_Strategy_Full_Analysis.docx
@@ -823,7 +823,7 @@
           <w:rFonts w:ascii="Calibri" w:hAnsi="Calibri"/>
           <w:sz w:val="20"/>
         </w:rPr>
-        <w:t>$370B+ in assets under custody -- largest regulated crypto custodian globally</w:t>
+        <w:t>$300B+ in assets under custody -- largest regulated crypto custodian globally</w:t>
       </w:r>
     </w:p>
     <w:p>
@@ -859,7 +859,7 @@
           <w:rFonts w:ascii="Calibri" w:hAnsi="Calibri"/>
           <w:sz w:val="20"/>
         </w:rPr>
-        <w:t>Insurance: $320M via Lloyd's of London syndicate</w:t>
+        <w:t>Insurance: $320M via commercial crime insurance policy</w:t>
       </w:r>
     </w:p>
     <w:p>
@@ -1202,7 +1202,7 @@
                 <w:rFonts w:ascii="Calibri" w:hAnsi="Calibri"/>
                 <w:sz w:val="18"/>
               </w:rPr>
-              <w:t>$320M Lloyd's syndicate</w:t>
+              <w:t>$320M commercial crime insurance</w:t>
             </w:r>
           </w:p>
         </w:tc>
@@ -1342,7 +1342,7 @@
           <w:rFonts w:ascii="Calibri" w:hAnsi="Calibri"/>
           <w:sz w:val="20"/>
         </w:rPr>
-        <w:t>$370B custody + $320M insurance -- institutional-grade security</w:t>
+        <w:t>$300B custody + $320M insurance -- institutional-grade security</w:t>
       </w:r>
     </w:p>
     <w:p>
@@ -4188,7 +4188,7 @@
                 <w:rFonts w:ascii="Calibri" w:hAnsi="Calibri"/>
                 <w:sz w:val="18"/>
               </w:rPr>
-              <w:t>$320M Lloyd's</w:t>
+              <w:t>$320M commercial crime</w:t>
             </w:r>
           </w:p>
         </w:tc>
@@ -4263,7 +4263,7 @@
                 <w:rFonts w:ascii="Calibri" w:hAnsi="Calibri"/>
                 <w:sz w:val="18"/>
               </w:rPr>
-              <w:t>$370B+</w:t>
+              <w:t>$300B+</w:t>
             </w:r>
           </w:p>
         </w:tc>
@@ -4732,7 +4732,7 @@
                 <w:rFonts w:ascii="Calibri" w:hAnsi="Calibri"/>
                 <w:sz w:val="18"/>
               </w:rPr>
-              <w:t>Only white-label MPC wallets + x402 creator + SOC 2 + $370B custody</w:t>
+              <w:t>Only white-label MPC wallets + x402 creator + SOC 2 + $300B custody</w:t>
             </w:r>
           </w:p>
         </w:tc>

</xml_diff>